<commit_message>
Update to latest local version
</commit_message>
<xml_diff>
--- a/template/Resis-test.docx
+++ b/template/Resis-test.docx
@@ -1908,13 +1908,11 @@
               <w:jc w:val="center"/>
               <w:rPr>
                 <w:rFonts w:ascii="Times New Roman" w:hAnsi="Times New Roman"/>
-                <w:highlight w:val="yellow"/>
-              </w:rPr>
-            </w:pPr>
-            <w:r>
-              <w:rPr>
-                <w:rFonts w:ascii="Times New Roman" w:hAnsi="Times New Roman" w:hint="eastAsia"/>
-                <w:highlight w:val="yellow"/>
+              </w:rPr>
+            </w:pPr>
+            <w:r>
+              <w:rPr>
+                <w:rFonts w:ascii="Times New Roman" w:hAnsi="Times New Roman" w:hint="eastAsia"/>
               </w:rPr>
               <w:t>@1</w:t>
             </w:r>
@@ -1929,13 +1927,11 @@
               <w:jc w:val="center"/>
               <w:rPr>
                 <w:rFonts w:ascii="Times New Roman" w:hAnsi="Times New Roman"/>
-                <w:highlight w:val="yellow"/>
-              </w:rPr>
-            </w:pPr>
-            <w:r>
-              <w:rPr>
-                <w:rFonts w:ascii="Times New Roman" w:hAnsi="Times New Roman" w:hint="eastAsia"/>
-                <w:highlight w:val="yellow"/>
+              </w:rPr>
+            </w:pPr>
+            <w:r>
+              <w:rPr>
+                <w:rFonts w:ascii="Times New Roman" w:hAnsi="Times New Roman" w:hint="eastAsia"/>
               </w:rPr>
               <w:t>@2</w:t>
             </w:r>
@@ -1950,7 +1946,6 @@
               <w:jc w:val="center"/>
               <w:rPr>
                 <w:rFonts w:ascii="Times New Roman" w:hAnsi="Times New Roman"/>
-                <w:highlight w:val="yellow"/>
               </w:rPr>
             </w:pPr>
           </w:p>
@@ -1964,7 +1959,6 @@
               <w:jc w:val="center"/>
               <w:rPr>
                 <w:rFonts w:ascii="Times New Roman" w:hAnsi="Times New Roman"/>
-                <w:highlight w:val="yellow"/>
               </w:rPr>
             </w:pPr>
           </w:p>
@@ -1978,7 +1972,6 @@
               <w:jc w:val="center"/>
               <w:rPr>
                 <w:rFonts w:ascii="Times New Roman" w:hAnsi="Times New Roman"/>
-                <w:highlight w:val="yellow"/>
               </w:rPr>
             </w:pPr>
           </w:p>
@@ -2014,20 +2007,17 @@
               <w:jc w:val="center"/>
               <w:rPr>
                 <w:rFonts w:ascii="Times New Roman" w:hAnsi="Times New Roman"/>
-                <w:highlight w:val="yellow"/>
-              </w:rPr>
-            </w:pPr>
-            <w:r>
-              <w:rPr>
-                <w:rFonts w:ascii="Times New Roman" w:hAnsi="Times New Roman" w:hint="eastAsia"/>
-                <w:highlight w:val="yellow"/>
+              </w:rPr>
+            </w:pPr>
+            <w:r>
+              <w:rPr>
+                <w:rFonts w:ascii="Times New Roman" w:hAnsi="Times New Roman" w:hint="eastAsia"/>
               </w:rPr>
               <w:t>@</w:t>
             </w:r>
             <w:r>
               <w:rPr>
                 <w:rFonts w:ascii="Times New Roman" w:hAnsi="Times New Roman" w:hint="eastAsia"/>
-                <w:highlight w:val="yellow"/>
               </w:rPr>
               <w:t>3</w:t>
             </w:r>
@@ -2042,7 +2032,6 @@
             <w:r>
               <w:rPr>
                 <w:rFonts w:ascii="Times New Roman" w:hAnsi="Times New Roman"/>
-                <w:highlight w:val="yellow"/>
               </w:rPr>
               <w:t>Whole view</w:t>
             </w:r>
@@ -3161,7 +3150,6 @@
                 <w:rFonts w:ascii="Times New Roman" w:hAnsi="Times New Roman"/>
                 <w:b/>
                 <w:noProof/>
-                <w:highlight w:val="yellow"/>
               </w:rPr>
             </w:pPr>
             <w:r>
@@ -3200,7 +3188,6 @@
               <w:jc w:val="center"/>
               <w:rPr>
                 <w:rFonts w:ascii="Times New Roman" w:hAnsi="Times New Roman"/>
-                <w:highlight w:val="yellow"/>
                 <w:u w:val="single"/>
               </w:rPr>
             </w:pPr>
@@ -3208,7 +3195,6 @@
               <w:rPr>
                 <w:rFonts w:ascii="Times New Roman" w:hAnsi="Times New Roman" w:hint="eastAsia"/>
                 <w:noProof/>
-                <w:highlight w:val="yellow"/>
                 <w:u w:val="single"/>
               </w:rPr>
               <w:t>@Drill 1_1</w:t>
@@ -3220,14 +3206,12 @@
               <w:jc w:val="center"/>
               <w:rPr>
                 <w:rFonts w:ascii="Times New Roman" w:hAnsi="Times New Roman"/>
-                <w:highlight w:val="yellow"/>
                 <w:u w:val="single"/>
               </w:rPr>
             </w:pPr>
             <w:r>
               <w:rPr>
                 <w:rFonts w:ascii="Times New Roman" w:hAnsi="Times New Roman" w:hint="eastAsia"/>
-                <w:highlight w:val="yellow"/>
                 <w:u w:val="single"/>
               </w:rPr>
               <w:t>D</w:t>
@@ -3235,7 +3219,6 @@
             <w:r>
               <w:rPr>
                 <w:rFonts w:ascii="Times New Roman" w:hAnsi="Times New Roman"/>
-                <w:highlight w:val="yellow"/>
                 <w:u w:val="single"/>
               </w:rPr>
               <w:t xml:space="preserve">irection of </w:t>
@@ -3243,7 +3226,6 @@
             <w:r>
               <w:rPr>
                 <w:rFonts w:ascii="Times New Roman" w:hAnsi="Times New Roman"/>
-                <w:highlight w:val="yellow"/>
                 <w:u w:val="single"/>
               </w:rPr>
               <w:t>Drill 1</w:t>
@@ -3251,7 +3233,6 @@
             <w:r>
               <w:rPr>
                 <w:rFonts w:ascii="Times New Roman" w:hAnsi="Times New Roman" w:hint="eastAsia"/>
-                <w:highlight w:val="yellow"/>
                 <w:u w:val="single"/>
               </w:rPr>
               <w:t xml:space="preserve"> (@Drilling 1_3)</w:t>
@@ -3292,7 +3273,6 @@
             <w:r>
               <w:rPr>
                 <w:rFonts w:ascii="Times New Roman" w:hAnsi="Times New Roman" w:hint="eastAsia"/>
-                <w:highlight w:val="yellow"/>
                 <w:u w:val="single"/>
               </w:rPr>
               <w:t>R</w:t>
@@ -3300,7 +3280,6 @@
             <w:r>
               <w:rPr>
                 <w:rFonts w:ascii="Times New Roman" w:hAnsi="Times New Roman"/>
-                <w:highlight w:val="yellow"/>
                 <w:u w:val="single"/>
               </w:rPr>
               <w:t>esistograph</w:t>
@@ -3309,7 +3288,6 @@
             <w:r>
               <w:rPr>
                 <w:rFonts w:ascii="Times New Roman" w:hAnsi="Times New Roman"/>
-                <w:highlight w:val="yellow"/>
                 <w:u w:val="single"/>
               </w:rPr>
               <w:t xml:space="preserve"> of Drill 1</w:t>
@@ -3335,14 +3313,12 @@
                 <w:b/>
                 <w:noProof/>
                 <w:sz w:val="28"/>
-                <w:highlight w:val="yellow"/>
-              </w:rPr>
-            </w:pPr>
-            <w:r>
-              <w:rPr>
-                <w:rFonts w:ascii="Times New Roman" w:hAnsi="Times New Roman" w:hint="eastAsia"/>
-                <w:noProof/>
-                <w:highlight w:val="yellow"/>
+              </w:rPr>
+            </w:pPr>
+            <w:r>
+              <w:rPr>
+                <w:rFonts w:ascii="Times New Roman" w:hAnsi="Times New Roman" w:hint="eastAsia"/>
+                <w:noProof/>
                 <w:u w:val="single"/>
               </w:rPr>
               <w:t>@Drilling 1_2</w:t>
@@ -3364,118 +3340,101 @@
               <w:jc w:val="both"/>
               <w:rPr>
                 <w:rFonts w:ascii="Times New Roman" w:hAnsi="Times New Roman"/>
-                <w:highlight w:val="yellow"/>
-              </w:rPr>
-            </w:pPr>
-            <w:r>
-              <w:rPr>
-                <w:rFonts w:ascii="Times New Roman" w:hAnsi="Times New Roman" w:hint="eastAsia"/>
-                <w:highlight w:val="yellow"/>
+              </w:rPr>
+            </w:pPr>
+            <w:r>
+              <w:rPr>
+                <w:rFonts w:ascii="Times New Roman" w:hAnsi="Times New Roman" w:hint="eastAsia"/>
               </w:rPr>
               <w:t>D</w:t>
             </w:r>
             <w:r>
               <w:rPr>
                 <w:rFonts w:ascii="Times New Roman" w:hAnsi="Times New Roman"/>
-                <w:highlight w:val="yellow"/>
               </w:rPr>
               <w:t xml:space="preserve">rill 1 was performed at </w:t>
             </w:r>
             <w:r>
               <w:rPr>
                 <w:rFonts w:ascii="Times New Roman" w:hAnsi="Times New Roman" w:hint="eastAsia"/>
-                <w:highlight w:val="yellow"/>
               </w:rPr>
               <w:t>5</w:t>
             </w:r>
             <w:r>
               <w:rPr>
                 <w:rFonts w:ascii="Times New Roman" w:hAnsi="Times New Roman"/>
-                <w:highlight w:val="yellow"/>
               </w:rPr>
               <w:t xml:space="preserve"> </w:t>
             </w:r>
             <w:r>
               <w:rPr>
                 <w:rFonts w:ascii="Times New Roman" w:hAnsi="Times New Roman" w:hint="eastAsia"/>
-                <w:highlight w:val="yellow"/>
               </w:rPr>
               <w:t>cm</w:t>
             </w:r>
             <w:r>
               <w:rPr>
                 <w:rFonts w:ascii="Times New Roman" w:hAnsi="Times New Roman"/>
-                <w:highlight w:val="yellow"/>
               </w:rPr>
               <w:t xml:space="preserve"> above ground </w:t>
             </w:r>
             <w:r>
               <w:rPr>
                 <w:rFonts w:ascii="Times New Roman" w:hAnsi="Times New Roman" w:hint="eastAsia"/>
-                <w:highlight w:val="yellow"/>
               </w:rPr>
               <w:t>on the surface of the area of sap flow</w:t>
             </w:r>
             <w:r>
               <w:rPr>
                 <w:rFonts w:ascii="Times New Roman" w:hAnsi="Times New Roman" w:hint="eastAsia"/>
-                <w:highlight w:val="yellow"/>
               </w:rPr>
               <w:t>. No s</w:t>
             </w:r>
             <w:r>
               <w:rPr>
                 <w:rFonts w:ascii="Times New Roman" w:hAnsi="Times New Roman"/>
-                <w:highlight w:val="yellow"/>
               </w:rPr>
               <w:t xml:space="preserve">ignificant </w:t>
             </w:r>
             <w:r>
               <w:rPr>
                 <w:rFonts w:ascii="Times New Roman" w:hAnsi="Times New Roman"/>
-                <w:highlight w:val="yellow"/>
               </w:rPr>
               <w:t>drops</w:t>
             </w:r>
             <w:r>
               <w:rPr>
                 <w:rFonts w:ascii="Times New Roman" w:hAnsi="Times New Roman" w:hint="eastAsia"/>
-                <w:highlight w:val="yellow"/>
               </w:rPr>
               <w:t xml:space="preserve"> i</w:t>
             </w:r>
             <w:r>
               <w:rPr>
                 <w:rFonts w:ascii="Times New Roman" w:hAnsi="Times New Roman"/>
-                <w:highlight w:val="yellow"/>
               </w:rPr>
               <w:t xml:space="preserve">n resistance </w:t>
             </w:r>
             <w:r>
               <w:rPr>
                 <w:rFonts w:ascii="Times New Roman" w:hAnsi="Times New Roman" w:hint="eastAsia"/>
-                <w:highlight w:val="yellow"/>
               </w:rPr>
               <w:t xml:space="preserve">and decay </w:t>
             </w:r>
             <w:r>
               <w:rPr>
                 <w:rFonts w:ascii="Times New Roman" w:hAnsi="Times New Roman"/>
-                <w:highlight w:val="yellow"/>
               </w:rPr>
               <w:t>were</w:t>
             </w:r>
             <w:r>
               <w:rPr>
                 <w:rFonts w:ascii="Times New Roman" w:hAnsi="Times New Roman"/>
-                <w:highlight w:val="yellow"/>
               </w:rPr>
               <w:t xml:space="preserve"> detected</w:t>
             </w:r>
             <w:r>
               <w:rPr>
                 <w:rFonts w:ascii="Times New Roman" w:hAnsi="Times New Roman" w:hint="eastAsia"/>
-                <w:highlight w:val="yellow"/>
               </w:rPr>
               <w:t>.</w:t>
             </w:r>
@@ -3514,7 +3473,6 @@
                 <w:rFonts w:ascii="Times New Roman" w:hAnsi="Times New Roman"/>
                 <w:b/>
                 <w:noProof/>
-                <w:highlight w:val="yellow"/>
               </w:rPr>
             </w:pPr>
             <w:r>
@@ -3553,7 +3511,6 @@
               <w:jc w:val="center"/>
               <w:rPr>
                 <w:rFonts w:ascii="Times New Roman" w:hAnsi="Times New Roman"/>
-                <w:highlight w:val="yellow"/>
                 <w:u w:val="single"/>
               </w:rPr>
             </w:pPr>
@@ -3561,7 +3518,6 @@
               <w:rPr>
                 <w:rFonts w:ascii="Times New Roman" w:hAnsi="Times New Roman" w:hint="eastAsia"/>
                 <w:noProof/>
-                <w:highlight w:val="yellow"/>
                 <w:u w:val="single"/>
               </w:rPr>
               <w:t>@Drill 2_1</w:t>
@@ -3573,14 +3529,12 @@
               <w:jc w:val="center"/>
               <w:rPr>
                 <w:rFonts w:ascii="Times New Roman" w:hAnsi="Times New Roman"/>
-                <w:highlight w:val="yellow"/>
                 <w:u w:val="single"/>
               </w:rPr>
             </w:pPr>
             <w:r>
               <w:rPr>
                 <w:rFonts w:ascii="Times New Roman" w:hAnsi="Times New Roman" w:hint="eastAsia"/>
-                <w:highlight w:val="yellow"/>
                 <w:u w:val="single"/>
               </w:rPr>
               <w:t>D</w:t>
@@ -3588,7 +3542,6 @@
             <w:r>
               <w:rPr>
                 <w:rFonts w:ascii="Times New Roman" w:hAnsi="Times New Roman"/>
-                <w:highlight w:val="yellow"/>
                 <w:u w:val="single"/>
               </w:rPr>
               <w:t>irection of Drill 2 (</w:t>
@@ -3596,7 +3549,6 @@
             <w:r>
               <w:rPr>
                 <w:rFonts w:ascii="Times New Roman" w:hAnsi="Times New Roman" w:hint="eastAsia"/>
-                <w:highlight w:val="yellow"/>
                 <w:u w:val="single"/>
               </w:rPr>
               <w:t>@Drilling 2_3</w:t>
@@ -3604,7 +3556,6 @@
             <w:r>
               <w:rPr>
                 <w:rFonts w:ascii="Times New Roman" w:hAnsi="Times New Roman"/>
-                <w:highlight w:val="yellow"/>
                 <w:u w:val="single"/>
               </w:rPr>
               <w:t>)</w:t>
@@ -3645,7 +3596,6 @@
             <w:r>
               <w:rPr>
                 <w:rFonts w:ascii="Times New Roman" w:hAnsi="Times New Roman" w:hint="eastAsia"/>
-                <w:highlight w:val="yellow"/>
                 <w:u w:val="single"/>
               </w:rPr>
               <w:t>R</w:t>
@@ -3653,7 +3603,6 @@
             <w:r>
               <w:rPr>
                 <w:rFonts w:ascii="Times New Roman" w:hAnsi="Times New Roman"/>
-                <w:highlight w:val="yellow"/>
                 <w:u w:val="single"/>
               </w:rPr>
               <w:t>esistograph</w:t>
@@ -3662,7 +3611,6 @@
             <w:r>
               <w:rPr>
                 <w:rFonts w:ascii="Times New Roman" w:hAnsi="Times New Roman"/>
-                <w:highlight w:val="yellow"/>
                 <w:u w:val="single"/>
               </w:rPr>
               <w:t xml:space="preserve"> of Drill 2</w:t>
@@ -3688,14 +3636,12 @@
                 <w:b/>
                 <w:noProof/>
                 <w:sz w:val="28"/>
-                <w:highlight w:val="yellow"/>
-              </w:rPr>
-            </w:pPr>
-            <w:r>
-              <w:rPr>
-                <w:rFonts w:ascii="Times New Roman" w:hAnsi="Times New Roman" w:hint="eastAsia"/>
-                <w:noProof/>
-                <w:highlight w:val="yellow"/>
+              </w:rPr>
+            </w:pPr>
+            <w:r>
+              <w:rPr>
+                <w:rFonts w:ascii="Times New Roman" w:hAnsi="Times New Roman" w:hint="eastAsia"/>
+                <w:noProof/>
                 <w:u w:val="single"/>
               </w:rPr>
               <w:t>@Drilling 2_2</w:t>
@@ -3717,125 +3663,107 @@
               <w:jc w:val="both"/>
               <w:rPr>
                 <w:rFonts w:ascii="Times New Roman" w:hAnsi="Times New Roman"/>
-                <w:highlight w:val="yellow"/>
-              </w:rPr>
-            </w:pPr>
-            <w:r>
-              <w:rPr>
-                <w:rFonts w:ascii="Times New Roman" w:hAnsi="Times New Roman" w:hint="eastAsia"/>
-                <w:highlight w:val="yellow"/>
+              </w:rPr>
+            </w:pPr>
+            <w:r>
+              <w:rPr>
+                <w:rFonts w:ascii="Times New Roman" w:hAnsi="Times New Roman" w:hint="eastAsia"/>
               </w:rPr>
               <w:t>D</w:t>
             </w:r>
             <w:r>
               <w:rPr>
                 <w:rFonts w:ascii="Times New Roman" w:hAnsi="Times New Roman"/>
-                <w:highlight w:val="yellow"/>
               </w:rPr>
               <w:t xml:space="preserve">rill </w:t>
             </w:r>
             <w:r>
               <w:rPr>
                 <w:rFonts w:ascii="Times New Roman" w:hAnsi="Times New Roman" w:hint="eastAsia"/>
-                <w:highlight w:val="yellow"/>
               </w:rPr>
               <w:t>2</w:t>
             </w:r>
             <w:r>
               <w:rPr>
                 <w:rFonts w:ascii="Times New Roman" w:hAnsi="Times New Roman"/>
-                <w:highlight w:val="yellow"/>
               </w:rPr>
               <w:t xml:space="preserve"> was performed at </w:t>
             </w:r>
             <w:r>
               <w:rPr>
                 <w:rFonts w:ascii="Times New Roman" w:hAnsi="Times New Roman" w:hint="eastAsia"/>
-                <w:highlight w:val="yellow"/>
               </w:rPr>
               <w:t>5</w:t>
             </w:r>
             <w:r>
               <w:rPr>
                 <w:rFonts w:ascii="Times New Roman" w:hAnsi="Times New Roman"/>
-                <w:highlight w:val="yellow"/>
               </w:rPr>
               <w:t xml:space="preserve"> </w:t>
             </w:r>
             <w:r>
               <w:rPr>
                 <w:rFonts w:ascii="Times New Roman" w:hAnsi="Times New Roman" w:hint="eastAsia"/>
-                <w:highlight w:val="yellow"/>
               </w:rPr>
               <w:t>cm</w:t>
             </w:r>
             <w:r>
               <w:rPr>
                 <w:rFonts w:ascii="Times New Roman" w:hAnsi="Times New Roman"/>
-                <w:highlight w:val="yellow"/>
               </w:rPr>
               <w:t xml:space="preserve"> above ground</w:t>
             </w:r>
             <w:r>
               <w:rPr>
                 <w:rFonts w:ascii="Times New Roman" w:hAnsi="Times New Roman"/>
-                <w:highlight w:val="yellow"/>
               </w:rPr>
               <w:t>,</w:t>
             </w:r>
             <w:r>
               <w:rPr>
                 <w:rFonts w:ascii="Times New Roman" w:hAnsi="Times New Roman"/>
-                <w:highlight w:val="yellow"/>
               </w:rPr>
               <w:t xml:space="preserve"> </w:t>
             </w:r>
             <w:r>
               <w:rPr>
                 <w:rFonts w:ascii="Times New Roman" w:hAnsi="Times New Roman" w:hint="eastAsia"/>
-                <w:highlight w:val="yellow"/>
               </w:rPr>
               <w:t>perpendicular to drilling#1. No s</w:t>
             </w:r>
             <w:r>
               <w:rPr>
                 <w:rFonts w:ascii="Times New Roman" w:hAnsi="Times New Roman"/>
-                <w:highlight w:val="yellow"/>
               </w:rPr>
               <w:t>ignificant drops</w:t>
             </w:r>
             <w:r>
               <w:rPr>
                 <w:rFonts w:ascii="Times New Roman" w:hAnsi="Times New Roman" w:hint="eastAsia"/>
-                <w:highlight w:val="yellow"/>
               </w:rPr>
               <w:t xml:space="preserve"> i</w:t>
             </w:r>
             <w:r>
               <w:rPr>
                 <w:rFonts w:ascii="Times New Roman" w:hAnsi="Times New Roman"/>
-                <w:highlight w:val="yellow"/>
               </w:rPr>
               <w:t xml:space="preserve">n resistance </w:t>
             </w:r>
             <w:r>
               <w:rPr>
                 <w:rFonts w:ascii="Times New Roman" w:hAnsi="Times New Roman" w:hint="eastAsia"/>
-                <w:highlight w:val="yellow"/>
               </w:rPr>
               <w:t xml:space="preserve">and decay </w:t>
             </w:r>
             <w:r>
               <w:rPr>
                 <w:rFonts w:ascii="Times New Roman" w:hAnsi="Times New Roman"/>
-                <w:highlight w:val="yellow"/>
               </w:rPr>
               <w:t>were detected</w:t>
             </w:r>
             <w:r>
               <w:rPr>
                 <w:rFonts w:ascii="Times New Roman" w:hAnsi="Times New Roman" w:hint="eastAsia"/>
-                <w:highlight w:val="yellow"/>
               </w:rPr>
               <w:t>.</w:t>
             </w:r>

</xml_diff>